<commit_message>
hasmap interview set 1
</commit_message>
<xml_diff>
--- a/TheorynCoding/Study Material/Java Overall/Java Overall/Quick Java/oza sir/Study This/study material/Interview Question/Question Set.docx
+++ b/TheorynCoding/Study Material/Java Overall/Java Overall/Quick Java/oza sir/Study This/study material/Interview Question/Question Set.docx
@@ -1283,8 +1283,311 @@
         </w:rPr>
         <w:t>→ Pagination and Unique Constraints</w:t>
       </w:r>
+    </w:p>
+    <w:p>
+      <w:pPr>
+        <w:pStyle w:val="ListParagraph"/>
+        <w:rPr>
+          <w:rFonts w:ascii="Segoe UI" w:hAnsi="Segoe UI" w:cs="Segoe UI"/>
+          <w:sz w:val="21"/>
+          <w:szCs w:val="21"/>
+          <w:shd w:val="clear" w:color="auto" w:fill="FFFFFF"/>
+        </w:rPr>
+      </w:pPr>
+    </w:p>
+    <w:p>
+      <w:pPr>
+        <w:pStyle w:val="ListParagraph"/>
+        <w:numPr>
+          <w:ilvl w:val="0"/>
+          <w:numId w:val="4"/>
+        </w:numPr>
+        <w:rPr>
+          <w:rFonts w:ascii="Segoe UI" w:hAnsi="Segoe UI" w:cs="Segoe UI"/>
+          <w:sz w:val="21"/>
+          <w:szCs w:val="21"/>
+          <w:shd w:val="clear" w:color="auto" w:fill="FFFFFF"/>
+        </w:rPr>
+      </w:pPr>
       <w:bookmarkStart w:id="0" w:name="_GoBack"/>
       <w:bookmarkEnd w:id="0"/>
+      <w:r>
+        <w:rPr>
+          <w:rFonts w:ascii="Segoe UI" w:hAnsi="Segoe UI" w:cs="Segoe UI"/>
+          <w:sz w:val="21"/>
+          <w:szCs w:val="21"/>
+          <w:shd w:val="clear" w:color="auto" w:fill="FFFFFF"/>
+        </w:rPr>
+        <w:t>Collections</w:t>
+      </w:r>
+      <w:proofErr w:type="gramStart"/>
+      <w:r>
+        <w:rPr>
+          <w:rFonts w:ascii="Segoe UI" w:hAnsi="Segoe UI" w:cs="Segoe UI"/>
+          <w:sz w:val="21"/>
+          <w:szCs w:val="21"/>
+          <w:shd w:val="clear" w:color="auto" w:fill="FFFFFF"/>
+        </w:rPr>
+        <w:t>:</w:t>
+      </w:r>
+      <w:proofErr w:type="gramEnd"/>
+      <w:r>
+        <w:rPr>
+          <w:rFonts w:ascii="Segoe UI" w:hAnsi="Segoe UI" w:cs="Segoe UI"/>
+          <w:sz w:val="21"/>
+          <w:szCs w:val="21"/>
+          <w:bdr w:val="none" w:sz="0" w:space="0" w:color="auto" w:frame="1"/>
+        </w:rPr>
+        <w:br/>
+      </w:r>
+      <w:r>
+        <w:rPr>
+          <w:rFonts w:ascii="Segoe UI" w:hAnsi="Segoe UI" w:cs="Segoe UI"/>
+          <w:sz w:val="21"/>
+          <w:szCs w:val="21"/>
+          <w:shd w:val="clear" w:color="auto" w:fill="FFFFFF"/>
+        </w:rPr>
+        <w:t xml:space="preserve">→ Internal Working of </w:t>
+      </w:r>
+      <w:proofErr w:type="spellStart"/>
+      <w:r>
+        <w:rPr>
+          <w:rFonts w:ascii="Segoe UI" w:hAnsi="Segoe UI" w:cs="Segoe UI"/>
+          <w:sz w:val="21"/>
+          <w:szCs w:val="21"/>
+          <w:shd w:val="clear" w:color="auto" w:fill="FFFFFF"/>
+        </w:rPr>
+        <w:t>HashMap</w:t>
+      </w:r>
+      <w:proofErr w:type="spellEnd"/>
+      <w:r>
+        <w:rPr>
+          <w:rFonts w:ascii="Segoe UI" w:hAnsi="Segoe UI" w:cs="Segoe UI"/>
+          <w:sz w:val="21"/>
+          <w:szCs w:val="21"/>
+          <w:bdr w:val="none" w:sz="0" w:space="0" w:color="auto" w:frame="1"/>
+        </w:rPr>
+        <w:br/>
+      </w:r>
+      <w:r>
+        <w:rPr>
+          <w:rFonts w:ascii="Segoe UI" w:hAnsi="Segoe UI" w:cs="Segoe UI"/>
+          <w:sz w:val="21"/>
+          <w:szCs w:val="21"/>
+          <w:shd w:val="clear" w:color="auto" w:fill="FFFFFF"/>
+        </w:rPr>
+        <w:t xml:space="preserve">→ </w:t>
+      </w:r>
+      <w:proofErr w:type="spellStart"/>
+      <w:r>
+        <w:rPr>
+          <w:rFonts w:ascii="Segoe UI" w:hAnsi="Segoe UI" w:cs="Segoe UI"/>
+          <w:sz w:val="21"/>
+          <w:szCs w:val="21"/>
+          <w:shd w:val="clear" w:color="auto" w:fill="FFFFFF"/>
+        </w:rPr>
+        <w:t>HashMap</w:t>
+      </w:r>
+      <w:proofErr w:type="spellEnd"/>
+      <w:r>
+        <w:rPr>
+          <w:rFonts w:ascii="Segoe UI" w:hAnsi="Segoe UI" w:cs="Segoe UI"/>
+          <w:sz w:val="21"/>
+          <w:szCs w:val="21"/>
+          <w:shd w:val="clear" w:color="auto" w:fill="FFFFFF"/>
+        </w:rPr>
+        <w:t xml:space="preserve"> vs </w:t>
+      </w:r>
+      <w:proofErr w:type="spellStart"/>
+      <w:r>
+        <w:rPr>
+          <w:rFonts w:ascii="Segoe UI" w:hAnsi="Segoe UI" w:cs="Segoe UI"/>
+          <w:sz w:val="21"/>
+          <w:szCs w:val="21"/>
+          <w:shd w:val="clear" w:color="auto" w:fill="FFFFFF"/>
+        </w:rPr>
+        <w:t>Hashtable</w:t>
+      </w:r>
+      <w:proofErr w:type="spellEnd"/>
+      <w:r>
+        <w:rPr>
+          <w:rFonts w:ascii="Segoe UI" w:hAnsi="Segoe UI" w:cs="Segoe UI"/>
+          <w:sz w:val="21"/>
+          <w:szCs w:val="21"/>
+          <w:shd w:val="clear" w:color="auto" w:fill="FFFFFF"/>
+        </w:rPr>
+        <w:t xml:space="preserve"> vs </w:t>
+      </w:r>
+      <w:proofErr w:type="spellStart"/>
+      <w:r>
+        <w:rPr>
+          <w:rFonts w:ascii="Segoe UI" w:hAnsi="Segoe UI" w:cs="Segoe UI"/>
+          <w:sz w:val="21"/>
+          <w:szCs w:val="21"/>
+          <w:shd w:val="clear" w:color="auto" w:fill="FFFFFF"/>
+        </w:rPr>
+        <w:t>ConcurrentHashMap</w:t>
+      </w:r>
+      <w:proofErr w:type="spellEnd"/>
+      <w:r>
+        <w:rPr>
+          <w:rFonts w:ascii="Segoe UI" w:hAnsi="Segoe UI" w:cs="Segoe UI"/>
+          <w:sz w:val="21"/>
+          <w:szCs w:val="21"/>
+          <w:bdr w:val="none" w:sz="0" w:space="0" w:color="auto" w:frame="1"/>
+        </w:rPr>
+        <w:br/>
+      </w:r>
+      <w:r>
+        <w:rPr>
+          <w:rFonts w:ascii="Segoe UI" w:hAnsi="Segoe UI" w:cs="Segoe UI"/>
+          <w:sz w:val="21"/>
+          <w:szCs w:val="21"/>
+          <w:shd w:val="clear" w:color="auto" w:fill="FFFFFF"/>
+        </w:rPr>
+        <w:t>→ List vs Set vs Map (use cases and selection criteria)</w:t>
+      </w:r>
+      <w:r>
+        <w:rPr>
+          <w:rFonts w:ascii="Segoe UI" w:hAnsi="Segoe UI" w:cs="Segoe UI"/>
+          <w:sz w:val="21"/>
+          <w:szCs w:val="21"/>
+          <w:bdr w:val="none" w:sz="0" w:space="0" w:color="auto" w:frame="1"/>
+        </w:rPr>
+        <w:br/>
+      </w:r>
+      <w:r>
+        <w:rPr>
+          <w:rFonts w:ascii="Segoe UI" w:hAnsi="Segoe UI" w:cs="Segoe UI"/>
+          <w:sz w:val="21"/>
+          <w:szCs w:val="21"/>
+          <w:shd w:val="clear" w:color="auto" w:fill="FFFFFF"/>
+        </w:rPr>
+        <w:t xml:space="preserve">→ What is </w:t>
+      </w:r>
+      <w:proofErr w:type="spellStart"/>
+      <w:r>
+        <w:rPr>
+          <w:rFonts w:ascii="Segoe UI" w:hAnsi="Segoe UI" w:cs="Segoe UI"/>
+          <w:sz w:val="21"/>
+          <w:szCs w:val="21"/>
+          <w:shd w:val="clear" w:color="auto" w:fill="FFFFFF"/>
+        </w:rPr>
+        <w:t>LinkedList</w:t>
+      </w:r>
+      <w:proofErr w:type="spellEnd"/>
+      <w:r>
+        <w:rPr>
+          <w:rFonts w:ascii="Segoe UI" w:hAnsi="Segoe UI" w:cs="Segoe UI"/>
+          <w:sz w:val="21"/>
+          <w:szCs w:val="21"/>
+          <w:shd w:val="clear" w:color="auto" w:fill="FFFFFF"/>
+        </w:rPr>
+        <w:t>?</w:t>
+      </w:r>
+      <w:r>
+        <w:rPr>
+          <w:rFonts w:ascii="Segoe UI" w:hAnsi="Segoe UI" w:cs="Segoe UI"/>
+          <w:sz w:val="21"/>
+          <w:szCs w:val="21"/>
+          <w:bdr w:val="none" w:sz="0" w:space="0" w:color="auto" w:frame="1"/>
+        </w:rPr>
+        <w:br/>
+      </w:r>
+      <w:r>
+        <w:rPr>
+          <w:rFonts w:ascii="Segoe UI" w:hAnsi="Segoe UI" w:cs="Segoe UI"/>
+          <w:sz w:val="21"/>
+          <w:szCs w:val="21"/>
+          <w:shd w:val="clear" w:color="auto" w:fill="FFFFFF"/>
+        </w:rPr>
+        <w:t>→ Comparable Interface</w:t>
+      </w:r>
+      <w:r>
+        <w:rPr>
+          <w:rFonts w:ascii="Segoe UI" w:hAnsi="Segoe UI" w:cs="Segoe UI"/>
+          <w:sz w:val="21"/>
+          <w:szCs w:val="21"/>
+          <w:bdr w:val="none" w:sz="0" w:space="0" w:color="auto" w:frame="1"/>
+        </w:rPr>
+        <w:br/>
+      </w:r>
+      <w:r>
+        <w:rPr>
+          <w:rFonts w:ascii="Segoe UI" w:hAnsi="Segoe UI" w:cs="Segoe UI"/>
+          <w:sz w:val="21"/>
+          <w:szCs w:val="21"/>
+          <w:shd w:val="clear" w:color="auto" w:fill="FFFFFF"/>
+        </w:rPr>
+        <w:t xml:space="preserve">→ How </w:t>
+      </w:r>
+      <w:proofErr w:type="spellStart"/>
+      <w:r>
+        <w:rPr>
+          <w:rFonts w:ascii="Segoe UI" w:hAnsi="Segoe UI" w:cs="Segoe UI"/>
+          <w:sz w:val="21"/>
+          <w:szCs w:val="21"/>
+          <w:shd w:val="clear" w:color="auto" w:fill="FFFFFF"/>
+        </w:rPr>
+        <w:t>hashCode</w:t>
+      </w:r>
+      <w:proofErr w:type="spellEnd"/>
+      <w:r>
+        <w:rPr>
+          <w:rFonts w:ascii="Segoe UI" w:hAnsi="Segoe UI" w:cs="Segoe UI"/>
+          <w:sz w:val="21"/>
+          <w:szCs w:val="21"/>
+          <w:shd w:val="clear" w:color="auto" w:fill="FFFFFF"/>
+        </w:rPr>
+        <w:t>() is generated</w:t>
+      </w:r>
+      <w:r>
+        <w:rPr>
+          <w:rFonts w:ascii="Segoe UI" w:hAnsi="Segoe UI" w:cs="Segoe UI"/>
+          <w:sz w:val="21"/>
+          <w:szCs w:val="21"/>
+          <w:bdr w:val="none" w:sz="0" w:space="0" w:color="auto" w:frame="1"/>
+        </w:rPr>
+        <w:br/>
+      </w:r>
+      <w:r>
+        <w:rPr>
+          <w:rFonts w:ascii="Segoe UI" w:hAnsi="Segoe UI" w:cs="Segoe UI"/>
+          <w:sz w:val="21"/>
+          <w:szCs w:val="21"/>
+          <w:shd w:val="clear" w:color="auto" w:fill="FFFFFF"/>
+        </w:rPr>
+        <w:t xml:space="preserve">→ </w:t>
+      </w:r>
+      <w:proofErr w:type="spellStart"/>
+      <w:r>
+        <w:rPr>
+          <w:rFonts w:ascii="Segoe UI" w:hAnsi="Segoe UI" w:cs="Segoe UI"/>
+          <w:sz w:val="21"/>
+          <w:szCs w:val="21"/>
+          <w:shd w:val="clear" w:color="auto" w:fill="FFFFFF"/>
+        </w:rPr>
+        <w:t>Iterable</w:t>
+      </w:r>
+      <w:proofErr w:type="spellEnd"/>
+      <w:r>
+        <w:rPr>
+          <w:rFonts w:ascii="Segoe UI" w:hAnsi="Segoe UI" w:cs="Segoe UI"/>
+          <w:sz w:val="21"/>
+          <w:szCs w:val="21"/>
+          <w:shd w:val="clear" w:color="auto" w:fill="FFFFFF"/>
+        </w:rPr>
+        <w:t xml:space="preserve"> Interface</w:t>
+      </w:r>
+      <w:r>
+        <w:rPr>
+          <w:rFonts w:ascii="Segoe UI" w:hAnsi="Segoe UI" w:cs="Segoe UI"/>
+          <w:sz w:val="21"/>
+          <w:szCs w:val="21"/>
+          <w:bdr w:val="none" w:sz="0" w:space="0" w:color="auto" w:frame="1"/>
+        </w:rPr>
+        <w:br/>
+      </w:r>
       <w:r>
         <w:rPr>
           <w:rFonts w:ascii="Segoe UI" w:hAnsi="Segoe UI" w:cs="Segoe UI"/>

</xml_diff>

<commit_message>
interview question set 1
</commit_message>
<xml_diff>
--- a/TheorynCoding/Study Material/Java Overall/Java Overall/Quick Java/oza sir/Study This/study material/Interview Question/Question Set.docx
+++ b/TheorynCoding/Study Material/Java Overall/Java Overall/Quick Java/oza sir/Study This/study material/Interview Question/Question Set.docx
@@ -1309,105 +1309,105 @@
           <w:shd w:val="clear" w:color="auto" w:fill="FFFFFF"/>
         </w:rPr>
       </w:pPr>
+      <w:r>
+        <w:rPr>
+          <w:rFonts w:ascii="Segoe UI" w:hAnsi="Segoe UI" w:cs="Segoe UI"/>
+          <w:sz w:val="21"/>
+          <w:szCs w:val="21"/>
+          <w:shd w:val="clear" w:color="auto" w:fill="FFFFFF"/>
+        </w:rPr>
+        <w:t>Collections</w:t>
+      </w:r>
+      <w:proofErr w:type="gramStart"/>
+      <w:r>
+        <w:rPr>
+          <w:rFonts w:ascii="Segoe UI" w:hAnsi="Segoe UI" w:cs="Segoe UI"/>
+          <w:sz w:val="21"/>
+          <w:szCs w:val="21"/>
+          <w:shd w:val="clear" w:color="auto" w:fill="FFFFFF"/>
+        </w:rPr>
+        <w:t>:</w:t>
+      </w:r>
+      <w:proofErr w:type="gramEnd"/>
+      <w:r>
+        <w:rPr>
+          <w:rFonts w:ascii="Segoe UI" w:hAnsi="Segoe UI" w:cs="Segoe UI"/>
+          <w:sz w:val="21"/>
+          <w:szCs w:val="21"/>
+          <w:bdr w:val="none" w:sz="0" w:space="0" w:color="auto" w:frame="1"/>
+        </w:rPr>
+        <w:br/>
+      </w:r>
+      <w:r>
+        <w:rPr>
+          <w:rFonts w:ascii="Segoe UI" w:hAnsi="Segoe UI" w:cs="Segoe UI"/>
+          <w:sz w:val="21"/>
+          <w:szCs w:val="21"/>
+          <w:shd w:val="clear" w:color="auto" w:fill="FFFFFF"/>
+        </w:rPr>
+        <w:t xml:space="preserve">→ Internal Working of </w:t>
+      </w:r>
+      <w:proofErr w:type="spellStart"/>
+      <w:r>
+        <w:rPr>
+          <w:rFonts w:ascii="Segoe UI" w:hAnsi="Segoe UI" w:cs="Segoe UI"/>
+          <w:sz w:val="21"/>
+          <w:szCs w:val="21"/>
+          <w:shd w:val="clear" w:color="auto" w:fill="FFFFFF"/>
+        </w:rPr>
+        <w:t>HashMap</w:t>
+      </w:r>
+      <w:proofErr w:type="spellEnd"/>
+      <w:r>
+        <w:rPr>
+          <w:rFonts w:ascii="Segoe UI" w:hAnsi="Segoe UI" w:cs="Segoe UI"/>
+          <w:sz w:val="21"/>
+          <w:szCs w:val="21"/>
+          <w:bdr w:val="none" w:sz="0" w:space="0" w:color="auto" w:frame="1"/>
+        </w:rPr>
+        <w:br/>
+      </w:r>
+      <w:r>
+        <w:rPr>
+          <w:rFonts w:ascii="Segoe UI" w:hAnsi="Segoe UI" w:cs="Segoe UI"/>
+          <w:sz w:val="21"/>
+          <w:szCs w:val="21"/>
+          <w:shd w:val="clear" w:color="auto" w:fill="FFFFFF"/>
+        </w:rPr>
+        <w:t xml:space="preserve">→ </w:t>
+      </w:r>
+      <w:proofErr w:type="spellStart"/>
+      <w:r>
+        <w:rPr>
+          <w:rFonts w:ascii="Segoe UI" w:hAnsi="Segoe UI" w:cs="Segoe UI"/>
+          <w:sz w:val="21"/>
+          <w:szCs w:val="21"/>
+          <w:shd w:val="clear" w:color="auto" w:fill="FFFFFF"/>
+        </w:rPr>
+        <w:t>HashMap</w:t>
+      </w:r>
+      <w:proofErr w:type="spellEnd"/>
+      <w:r>
+        <w:rPr>
+          <w:rFonts w:ascii="Segoe UI" w:hAnsi="Segoe UI" w:cs="Segoe UI"/>
+          <w:sz w:val="21"/>
+          <w:szCs w:val="21"/>
+          <w:shd w:val="clear" w:color="auto" w:fill="FFFFFF"/>
+        </w:rPr>
+        <w:t xml:space="preserve"> vs </w:t>
+      </w:r>
+      <w:proofErr w:type="spellStart"/>
+      <w:r>
+        <w:rPr>
+          <w:rFonts w:ascii="Segoe UI" w:hAnsi="Segoe UI" w:cs="Segoe UI"/>
+          <w:sz w:val="21"/>
+          <w:szCs w:val="21"/>
+          <w:shd w:val="clear" w:color="auto" w:fill="FFFFFF"/>
+        </w:rPr>
+        <w:t>Hashtable</w:t>
+      </w:r>
       <w:bookmarkStart w:id="0" w:name="_GoBack"/>
       <w:bookmarkEnd w:id="0"/>
-      <w:r>
-        <w:rPr>
-          <w:rFonts w:ascii="Segoe UI" w:hAnsi="Segoe UI" w:cs="Segoe UI"/>
-          <w:sz w:val="21"/>
-          <w:szCs w:val="21"/>
-          <w:shd w:val="clear" w:color="auto" w:fill="FFFFFF"/>
-        </w:rPr>
-        <w:t>Collections</w:t>
-      </w:r>
-      <w:proofErr w:type="gramStart"/>
-      <w:r>
-        <w:rPr>
-          <w:rFonts w:ascii="Segoe UI" w:hAnsi="Segoe UI" w:cs="Segoe UI"/>
-          <w:sz w:val="21"/>
-          <w:szCs w:val="21"/>
-          <w:shd w:val="clear" w:color="auto" w:fill="FFFFFF"/>
-        </w:rPr>
-        <w:t>:</w:t>
-      </w:r>
-      <w:proofErr w:type="gramEnd"/>
-      <w:r>
-        <w:rPr>
-          <w:rFonts w:ascii="Segoe UI" w:hAnsi="Segoe UI" w:cs="Segoe UI"/>
-          <w:sz w:val="21"/>
-          <w:szCs w:val="21"/>
-          <w:bdr w:val="none" w:sz="0" w:space="0" w:color="auto" w:frame="1"/>
-        </w:rPr>
-        <w:br/>
-      </w:r>
-      <w:r>
-        <w:rPr>
-          <w:rFonts w:ascii="Segoe UI" w:hAnsi="Segoe UI" w:cs="Segoe UI"/>
-          <w:sz w:val="21"/>
-          <w:szCs w:val="21"/>
-          <w:shd w:val="clear" w:color="auto" w:fill="FFFFFF"/>
-        </w:rPr>
-        <w:t xml:space="preserve">→ Internal Working of </w:t>
-      </w:r>
-      <w:proofErr w:type="spellStart"/>
-      <w:r>
-        <w:rPr>
-          <w:rFonts w:ascii="Segoe UI" w:hAnsi="Segoe UI" w:cs="Segoe UI"/>
-          <w:sz w:val="21"/>
-          <w:szCs w:val="21"/>
-          <w:shd w:val="clear" w:color="auto" w:fill="FFFFFF"/>
-        </w:rPr>
-        <w:t>HashMap</w:t>
-      </w:r>
-      <w:proofErr w:type="spellEnd"/>
-      <w:r>
-        <w:rPr>
-          <w:rFonts w:ascii="Segoe UI" w:hAnsi="Segoe UI" w:cs="Segoe UI"/>
-          <w:sz w:val="21"/>
-          <w:szCs w:val="21"/>
-          <w:bdr w:val="none" w:sz="0" w:space="0" w:color="auto" w:frame="1"/>
-        </w:rPr>
-        <w:br/>
-      </w:r>
-      <w:r>
-        <w:rPr>
-          <w:rFonts w:ascii="Segoe UI" w:hAnsi="Segoe UI" w:cs="Segoe UI"/>
-          <w:sz w:val="21"/>
-          <w:szCs w:val="21"/>
-          <w:shd w:val="clear" w:color="auto" w:fill="FFFFFF"/>
-        </w:rPr>
-        <w:t xml:space="preserve">→ </w:t>
-      </w:r>
-      <w:proofErr w:type="spellStart"/>
-      <w:r>
-        <w:rPr>
-          <w:rFonts w:ascii="Segoe UI" w:hAnsi="Segoe UI" w:cs="Segoe UI"/>
-          <w:sz w:val="21"/>
-          <w:szCs w:val="21"/>
-          <w:shd w:val="clear" w:color="auto" w:fill="FFFFFF"/>
-        </w:rPr>
-        <w:t>HashMap</w:t>
-      </w:r>
-      <w:proofErr w:type="spellEnd"/>
-      <w:r>
-        <w:rPr>
-          <w:rFonts w:ascii="Segoe UI" w:hAnsi="Segoe UI" w:cs="Segoe UI"/>
-          <w:sz w:val="21"/>
-          <w:szCs w:val="21"/>
-          <w:shd w:val="clear" w:color="auto" w:fill="FFFFFF"/>
-        </w:rPr>
-        <w:t xml:space="preserve"> vs </w:t>
-      </w:r>
-      <w:proofErr w:type="spellStart"/>
-      <w:r>
-        <w:rPr>
-          <w:rFonts w:ascii="Segoe UI" w:hAnsi="Segoe UI" w:cs="Segoe UI"/>
-          <w:sz w:val="21"/>
-          <w:szCs w:val="21"/>
-          <w:shd w:val="clear" w:color="auto" w:fill="FFFFFF"/>
-        </w:rPr>
-        <w:t>Hashtable</w:t>
-      </w:r>
       <w:proofErr w:type="spellEnd"/>
       <w:r>
         <w:rPr>

</xml_diff>